<commit_message>
docs: All docs finalised
</commit_message>
<xml_diff>
--- a/docs/02a-research-plan.docx
+++ b/docs/02a-research-plan.docx
@@ -1088,7 +1088,13 @@
               <w:jc w:val="both"/>
             </w:pPr>
             <w:r>
-              <w:t>Findings will directly inform the MVP scope, feature backlog, assumptions and risks register, competitor analysis spreadsheet, and project roadmap. All supporting documents are cross-referenced in Section 13.</w:t>
+              <w:t xml:space="preserve">Findings will directly inform the MVP scope, feature backlog, </w:t>
+            </w:r>
+            <w:r>
+              <w:t>assumptions,</w:t>
+            </w:r>
+            <w:r>
+              <w:t xml:space="preserve"> and risks register, competitor analysis spreadsheet, and project roadmap. All supporting documents are cross-referenced in Section 13.</w:t>
             </w:r>
           </w:p>
         </w:tc>
@@ -1111,7 +1117,13 @@
         <w:jc w:val="both"/>
       </w:pPr>
       <w:r>
-        <w:t>The purpose of this research plan is to outline how the Drink Awareness App idea will be explored, tested and validated before development begins.</w:t>
+        <w:t xml:space="preserve">The purpose of this research plan is to outline how the Drink Awareness App idea will be explored, </w:t>
+      </w:r>
+      <w:r>
+        <w:t>tested,</w:t>
+      </w:r>
+      <w:r>
+        <w:t xml:space="preserve"> and validated before development begins.</w:t>
       </w:r>
     </w:p>
     <w:p>
@@ -1241,7 +1253,13 @@
         <w:jc w:val="both"/>
       </w:pPr>
       <w:r>
-        <w:t>Many people drink socially in pubs, bars, restaurants, clubs, events or private gatherings. During these situations, it can be easy to lose track of the number of drinks consumed, the amount of alcohol involved, or the money spent.</w:t>
+        <w:t xml:space="preserve">Many people drink socially in pubs, bars, restaurants, clubs, </w:t>
+      </w:r>
+      <w:r>
+        <w:t>events,</w:t>
+      </w:r>
+      <w:r>
+        <w:t xml:space="preserve"> or private gatherings. During these situations, it can be easy to lose track of the number of drinks consumed, the amount of alcohol involved, or the money spent.</w:t>
       </w:r>
     </w:p>
     <w:p>
@@ -1250,7 +1268,13 @@
         <w:jc w:val="both"/>
       </w:pPr>
       <w:r>
-        <w:t>The Drink Awareness App aims to address this issue by combining alcohol awareness with real-world social drinking contexts. Unlike a simple drink calculator, the app will connect drink logging with venues, menus, prices and personalised insights.</w:t>
+        <w:t xml:space="preserve">The Drink Awareness App aims to address this issue by combining alcohol awareness with real-world social drinking contexts. Unlike a simple drink calculator, the app will connect drink logging with venues, menus, </w:t>
+      </w:r>
+      <w:r>
+        <w:t>prices,</w:t>
+      </w:r>
+      <w:r>
+        <w:t xml:space="preserve"> and personalised insights.</w:t>
       </w:r>
     </w:p>
     <w:p>
@@ -1308,11 +1332,9 @@
       <w:r>
         <w:t xml:space="preserve">To identify common problems </w:t>
       </w:r>
-      <w:proofErr w:type="gramStart"/>
-      <w:r>
-        <w:t>users</w:t>
-      </w:r>
-      <w:proofErr w:type="gramEnd"/>
+      <w:r>
+        <w:t>users,</w:t>
+      </w:r>
       <w:r>
         <w:t xml:space="preserve"> experience when trying to monitor drinking habits.</w:t>
       </w:r>
@@ -1379,7 +1401,13 @@
         <w:spacing w:before="40" w:after="40"/>
       </w:pPr>
       <w:r>
-        <w:t>To identify competitor apps and understand their strengths, weaknesses and gaps.</w:t>
+        <w:t xml:space="preserve">To identify competitor apps and understand their strengths, </w:t>
+      </w:r>
+      <w:r>
+        <w:t>weaknesses,</w:t>
+      </w:r>
+      <w:r>
+        <w:t xml:space="preserve"> and gaps.</w:t>
       </w:r>
     </w:p>
     <w:p>
@@ -1418,7 +1446,13 @@
         <w:spacing w:before="40" w:after="40"/>
       </w:pPr>
       <w:r>
-        <w:t>To produce clear findings that can inform the MVP scope, feature backlog and design decisions.</w:t>
+        <w:t xml:space="preserve">To produce clear findings that can inform the MVP scope, feature </w:t>
+      </w:r>
+      <w:r>
+        <w:t>backlog,</w:t>
+      </w:r>
+      <w:r>
+        <w:t xml:space="preserve"> and design decisions.</w:t>
       </w:r>
     </w:p>
     <w:p>
@@ -1443,11 +1477,6 @@
     </w:p>
     <w:p>
       <w:pPr>
-        <w:spacing w:after="80"/>
-      </w:pPr>
-    </w:p>
-    <w:p>
-      <w:pPr>
         <w:pStyle w:val="Heading2"/>
       </w:pPr>
       <w:r>
@@ -1477,7 +1506,13 @@
         <w:spacing w:before="40" w:after="40"/>
       </w:pPr>
       <w:r>
-        <w:t>Where do users normally drink — pubs, bars, restaurants or events?</w:t>
+        <w:t xml:space="preserve">Where do users normally drink — pubs, bars, </w:t>
+      </w:r>
+      <w:r>
+        <w:t>restaurants,</w:t>
+      </w:r>
+      <w:r>
+        <w:t xml:space="preserve"> or events?</w:t>
       </w:r>
     </w:p>
     <w:p>
@@ -1521,11 +1556,6 @@
     </w:p>
     <w:p>
       <w:pPr>
-        <w:spacing w:after="80"/>
-      </w:pPr>
-    </w:p>
-    <w:p>
-      <w:pPr>
         <w:pStyle w:val="Heading2"/>
       </w:pPr>
       <w:r>
@@ -1568,7 +1598,13 @@
         <w:spacing w:before="40" w:after="40"/>
       </w:pPr>
       <w:r>
-        <w:t>Do users care about alcohol units, calories, spending, drink count or general patterns?</w:t>
+        <w:t xml:space="preserve">Do users care about alcohol units, calories, spending, drink </w:t>
+      </w:r>
+      <w:r>
+        <w:t>count,</w:t>
+      </w:r>
+      <w:r>
+        <w:t xml:space="preserve"> or general patterns?</w:t>
       </w:r>
     </w:p>
     <w:p>
@@ -1586,11 +1622,6 @@
     </w:p>
     <w:p>
       <w:pPr>
-        <w:spacing w:after="80"/>
-      </w:pPr>
-    </w:p>
-    <w:p>
-      <w:pPr>
         <w:pStyle w:val="Heading2"/>
       </w:pPr>
       <w:r>
@@ -1677,11 +1708,6 @@
     </w:p>
     <w:p>
       <w:pPr>
-        <w:spacing w:after="80"/>
-      </w:pPr>
-    </w:p>
-    <w:p>
-      <w:pPr>
         <w:pStyle w:val="Heading2"/>
       </w:pPr>
       <w:r>
@@ -1724,6 +1750,7 @@
         <w:spacing w:before="40" w:after="40"/>
       </w:pPr>
       <w:r>
+        <w:lastRenderedPageBreak/>
         <w:t>What features should be avoided because they could encourage excessive drinking?</w:t>
       </w:r>
     </w:p>
@@ -1752,11 +1779,6 @@
       <w:r>
         <w:t>What disclaimers or safeguards should be included?</w:t>
       </w:r>
-    </w:p>
-    <w:p>
-      <w:pPr>
-        <w:spacing w:after="80"/>
-      </w:pPr>
     </w:p>
     <w:p>
       <w:pPr>
@@ -2317,9 +2339,20 @@
         <w:jc w:val="both"/>
       </w:pPr>
       <w:r>
-        <w:lastRenderedPageBreak/>
         <w:t>The research will avoid targeting vulnerable users or presenting the app as medical support. Participants should not be people seeking clinical help for alcohol dependency.</w:t>
       </w:r>
+    </w:p>
+    <w:p>
+      <w:pPr>
+        <w:spacing w:after="120"/>
+        <w:jc w:val="both"/>
+      </w:pPr>
+    </w:p>
+    <w:p>
+      <w:pPr>
+        <w:spacing w:after="120"/>
+        <w:jc w:val="both"/>
+      </w:pPr>
     </w:p>
     <w:p>
       <w:pPr>
@@ -2329,6 +2362,7 @@
         </w:pBdr>
       </w:pPr>
       <w:r>
+        <w:lastRenderedPageBreak/>
         <w:t>6.  Research Methods</w:t>
       </w:r>
     </w:p>
@@ -2338,13 +2372,14 @@
         <w:jc w:val="both"/>
       </w:pPr>
       <w:r>
-        <w:t>The project will use a combination of desk research, competitor research and user research. Together, these methods will provide both contextual understanding and direct user feedback.</w:t>
-      </w:r>
-    </w:p>
-    <w:p>
-      <w:pPr>
-        <w:spacing w:after="80"/>
-      </w:pPr>
+        <w:t xml:space="preserve">The project will use a combination of desk research, competitor </w:t>
+      </w:r>
+      <w:r>
+        <w:t>research,</w:t>
+      </w:r>
+      <w:r>
+        <w:t xml:space="preserve"> and user research. Together, these methods will provide both contextual understanding and direct user feedback.</w:t>
+      </w:r>
     </w:p>
     <w:p>
       <w:pPr>
@@ -2360,7 +2395,13 @@
         <w:jc w:val="both"/>
       </w:pPr>
       <w:r>
-        <w:t>Desk research will be used to understand the wider context around alcohol awareness apps, drink tracking, venue discovery and responsible digital health design. This may include reviewing:</w:t>
+        <w:t xml:space="preserve">Desk research will be used to understand the wider context around alcohol awareness apps, drink tracking, venue </w:t>
+      </w:r>
+      <w:r>
+        <w:t>discovery,</w:t>
+      </w:r>
+      <w:r>
+        <w:t xml:space="preserve"> and responsible digital health design. This may include reviewing:</w:t>
       </w:r>
     </w:p>
     <w:p>
@@ -2457,11 +2498,6 @@
     </w:p>
     <w:p>
       <w:pPr>
-        <w:spacing w:after="80"/>
-      </w:pPr>
-    </w:p>
-    <w:p>
-      <w:pPr>
         <w:pStyle w:val="Heading2"/>
       </w:pPr>
       <w:r>
@@ -2488,11 +2524,6 @@
     </w:p>
     <w:p>
       <w:pPr>
-        <w:spacing w:after="80"/>
-      </w:pPr>
-    </w:p>
-    <w:p>
-      <w:pPr>
         <w:pStyle w:val="Heading2"/>
       </w:pPr>
       <w:r>
@@ -2519,11 +2550,6 @@
     </w:p>
     <w:p>
       <w:pPr>
-        <w:spacing w:after="80"/>
-      </w:pPr>
-    </w:p>
-    <w:p>
-      <w:pPr>
         <w:pStyle w:val="Heading2"/>
       </w:pPr>
       <w:r>
@@ -2536,11 +2562,7 @@
         <w:jc w:val="both"/>
       </w:pPr>
       <w:r>
-        <w:t xml:space="preserve">Short semi-structured interviews will be used to collect more detailed feedback from a smaller number of participants. Interviews will explore real social drinking situations, why people do or do </w:t>
-      </w:r>
-      <w:r>
-        <w:lastRenderedPageBreak/>
-        <w:t>not track alcohol consumption, what would make the app useful or annoying, how AI insights should be worded, and which features should be prioritised for the MVP.</w:t>
+        <w:t>Short semi-structured interviews will be used to collect more detailed feedback from a smaller number of participants. Interviews will explore real social drinking situations, why people do or do not track alcohol consumption, what would make the app useful or annoying, how AI insights should be worded, and which features should be prioritised for the MVP.</w:t>
       </w:r>
     </w:p>
     <w:p>
@@ -2554,11 +2576,6 @@
     </w:p>
     <w:p>
       <w:pPr>
-        <w:spacing w:after="80"/>
-      </w:pPr>
-    </w:p>
-    <w:p>
-      <w:pPr>
         <w:pStyle w:val="Heading2"/>
       </w:pPr>
       <w:r>
@@ -2571,7 +2588,11 @@
         <w:jc w:val="both"/>
       </w:pPr>
       <w:r>
-        <w:t>After the basic concept is explained, participants may be asked for feedback on the proposed MVP. This will help establish whether the app idea is understandable, whether the problem feels realistic, which features are most and least useful, and whether the app would realistically be used. Findings will be used to confirm or adjust the MVP scope before design and development begins.</w:t>
+        <w:t xml:space="preserve">After the basic concept is explained, participants may be asked for feedback on the proposed MVP. This will help establish whether the app idea is understandable, whether the problem feels realistic, which features are most and least useful, and whether the app would realistically be </w:t>
+      </w:r>
+      <w:r>
+        <w:lastRenderedPageBreak/>
+        <w:t>used. Findings will be used to confirm or adjust the MVP scope before design and development begins.</w:t>
       </w:r>
     </w:p>
     <w:p>
@@ -2593,11 +2614,6 @@
       <w:r>
         <w:t>Competitor research will be carried out to understand the existing market. The following categories and criteria will be used to structure the analysis.</w:t>
       </w:r>
-    </w:p>
-    <w:p>
-      <w:pPr>
-        <w:spacing w:after="80"/>
-      </w:pPr>
     </w:p>
     <w:p>
       <w:pPr>
@@ -2803,7 +2819,21 @@
                 <w:sz w:val="20"/>
                 <w:szCs w:val="20"/>
               </w:rPr>
-              <w:t>To understand how apps present progress, summaries and goals.</w:t>
+              <w:t xml:space="preserve">To understand how apps present progress, </w:t>
+            </w:r>
+            <w:r>
+              <w:rPr>
+                <w:sz w:val="20"/>
+                <w:szCs w:val="20"/>
+              </w:rPr>
+              <w:t>summaries,</w:t>
+            </w:r>
+            <w:r>
+              <w:rPr>
+                <w:sz w:val="20"/>
+                <w:szCs w:val="20"/>
+              </w:rPr>
+              <w:t xml:space="preserve"> and goals.</w:t>
             </w:r>
           </w:p>
         </w:tc>
@@ -2919,7 +2949,21 @@
                 <w:sz w:val="20"/>
                 <w:szCs w:val="20"/>
               </w:rPr>
-              <w:t>To understand map, search, venue listing and venue details features.</w:t>
+              <w:t xml:space="preserve">To understand map, search, venue </w:t>
+            </w:r>
+            <w:r>
+              <w:rPr>
+                <w:sz w:val="20"/>
+                <w:szCs w:val="20"/>
+              </w:rPr>
+              <w:t>listing,</w:t>
+            </w:r>
+            <w:r>
+              <w:rPr>
+                <w:sz w:val="20"/>
+                <w:szCs w:val="20"/>
+              </w:rPr>
+              <w:t xml:space="preserve"> and venue details features.</w:t>
             </w:r>
           </w:p>
         </w:tc>
@@ -3062,11 +3106,6 @@
       <w:r>
         <w:t>Each competitor will be reviewed against the following criteria and recorded in docs/competitor-analysis.xlsx:</w:t>
       </w:r>
-    </w:p>
-    <w:p>
-      <w:pPr>
-        <w:spacing w:after="80"/>
-      </w:pPr>
     </w:p>
     <w:tbl>
       <w:tblPr>
@@ -3264,7 +3303,21 @@
                 <w:sz w:val="20"/>
                 <w:szCs w:val="20"/>
               </w:rPr>
-              <w:t>iOS, Android, web or multi-platform.</w:t>
+              <w:t xml:space="preserve">iOS, Android, </w:t>
+            </w:r>
+            <w:r>
+              <w:rPr>
+                <w:sz w:val="20"/>
+                <w:szCs w:val="20"/>
+              </w:rPr>
+              <w:t>web,</w:t>
+            </w:r>
+            <w:r>
+              <w:rPr>
+                <w:sz w:val="20"/>
+                <w:szCs w:val="20"/>
+              </w:rPr>
+              <w:t xml:space="preserve"> or multi-platform.</w:t>
             </w:r>
           </w:p>
         </w:tc>
@@ -3352,7 +3405,6 @@
                 <w:sz w:val="20"/>
                 <w:szCs w:val="20"/>
               </w:rPr>
-              <w:lastRenderedPageBreak/>
               <w:t>Target users</w:t>
             </w:r>
           </w:p>
@@ -3381,7 +3433,21 @@
                 <w:sz w:val="20"/>
                 <w:szCs w:val="20"/>
               </w:rPr>
-              <w:t>Who the app appears to be aimed at.</w:t>
+              <w:t xml:space="preserve">Who the app </w:t>
+            </w:r>
+            <w:r>
+              <w:rPr>
+                <w:sz w:val="20"/>
+                <w:szCs w:val="20"/>
+              </w:rPr>
+              <w:t>is</w:t>
+            </w:r>
+            <w:r>
+              <w:rPr>
+                <w:sz w:val="20"/>
+                <w:szCs w:val="20"/>
+              </w:rPr>
+              <w:t xml:space="preserve"> aimed at.</w:t>
             </w:r>
           </w:p>
         </w:tc>
@@ -3555,7 +3621,21 @@
                 <w:sz w:val="20"/>
                 <w:szCs w:val="20"/>
               </w:rPr>
-              <w:t>Limitations, missing features or poor user experience.</w:t>
+              <w:t xml:space="preserve">Limitations, missing </w:t>
+            </w:r>
+            <w:r>
+              <w:rPr>
+                <w:sz w:val="20"/>
+                <w:szCs w:val="20"/>
+              </w:rPr>
+              <w:t>features,</w:t>
+            </w:r>
+            <w:r>
+              <w:rPr>
+                <w:sz w:val="20"/>
+                <w:szCs w:val="20"/>
+              </w:rPr>
+              <w:t xml:space="preserve"> or poor user experience.</w:t>
             </w:r>
           </w:p>
         </w:tc>
@@ -3696,6 +3776,7 @@
         <w:jc w:val="both"/>
       </w:pPr>
       <w:r>
+        <w:lastRenderedPageBreak/>
         <w:t>The competitor research should identify:</w:t>
       </w:r>
     </w:p>
@@ -3794,13 +3875,14 @@
         <w:jc w:val="both"/>
       </w:pPr>
       <w:r>
-        <w:t>The user research will focus on understanding the needs, expectations and concerns of potential users. A small early sample is appropriate for this validation stage — the goal is not academic-level statistical analysis, but practical feedback that can inform the MVP.</w:t>
-      </w:r>
-    </w:p>
-    <w:p>
-      <w:pPr>
-        <w:spacing w:after="80"/>
-      </w:pPr>
+        <w:t xml:space="preserve">The user research will focus on understanding the needs, </w:t>
+      </w:r>
+      <w:r>
+        <w:t>expectations,</w:t>
+      </w:r>
+      <w:r>
+        <w:t xml:space="preserve"> and concerns of potential users. A small early sample is appropriate for this validation stage — the goal is not academic-level statistical analysis, but practical feedback that can inform the MVP.</w:t>
+      </w:r>
     </w:p>
     <w:tbl>
       <w:tblPr>
@@ -4262,8 +4344,13 @@
         <w:spacing w:before="40" w:after="40"/>
       </w:pPr>
       <w:r>
-        <w:lastRenderedPageBreak/>
-        <w:t>Interest in venue discovery, menu information, manual logging, daily summaries, weekly summaries and AI insights.</w:t>
+        <w:t xml:space="preserve">Interest in venue discovery, menu information, manual logging, daily summaries, weekly </w:t>
+      </w:r>
+      <w:r>
+        <w:t>summaries,</w:t>
+      </w:r>
+      <w:r>
+        <w:t xml:space="preserve"> and AI insights.</w:t>
       </w:r>
     </w:p>
     <w:p>
@@ -4278,11 +4365,6 @@
       <w:r>
         <w:t>Privacy concerns and preferred app tone.</w:t>
       </w:r>
-    </w:p>
-    <w:p>
-      <w:pPr>
-        <w:spacing w:after="80"/>
-      </w:pPr>
     </w:p>
     <w:p>
       <w:pPr>
@@ -4376,7 +4458,13 @@
         <w:spacing w:before="40" w:after="40"/>
       </w:pPr>
       <w:r>
-        <w:t>Whether the app concept feels useful, intrusive or unnecessary.</w:t>
+        <w:t xml:space="preserve">Whether the app concept feels useful, </w:t>
+      </w:r>
+      <w:r>
+        <w:t>intrusive,</w:t>
+      </w:r>
+      <w:r>
+        <w:t xml:space="preserve"> or unnecessary.</w:t>
       </w:r>
     </w:p>
     <w:p>
@@ -4400,6 +4488,7 @@
         </w:pBdr>
       </w:pPr>
       <w:r>
+        <w:lastRenderedPageBreak/>
         <w:t>9.  Data to Collect</w:t>
       </w:r>
     </w:p>
@@ -4411,11 +4500,6 @@
       <w:r>
         <w:t>The research should collect both quantitative and qualitative data to give a rounded picture of user needs and preferences.</w:t>
       </w:r>
-    </w:p>
-    <w:p>
-      <w:pPr>
-        <w:spacing w:after="80"/>
-      </w:pPr>
     </w:p>
     <w:tbl>
       <w:tblPr>
@@ -4739,11 +4823,6 @@
         <w:t>Because this project involves alcohol-related behaviour, research must be carried out carefully and responsibly. The following principles apply to all research activities.</w:t>
       </w:r>
     </w:p>
-    <w:p>
-      <w:pPr>
-        <w:spacing w:after="80"/>
-      </w:pPr>
-    </w:p>
     <w:tbl>
       <w:tblPr>
         <w:tblW w:w="9360" w:type="dxa"/>
@@ -4793,7 +4872,6 @@
                 <w:sz w:val="20"/>
                 <w:szCs w:val="20"/>
               </w:rPr>
-              <w:lastRenderedPageBreak/>
               <w:t>Principle</w:t>
             </w:r>
           </w:p>
@@ -5173,7 +5251,21 @@
                 <w:sz w:val="20"/>
                 <w:szCs w:val="20"/>
               </w:rPr>
-              <w:t>Participants must not be asked for detailed personal drinking histories or medical information. Questions focus on habits, preferences and feature usefulness.</w:t>
+              <w:t xml:space="preserve">Participants must not be asked for detailed personal drinking histories or medical information. Questions focus on habits, </w:t>
+            </w:r>
+            <w:r>
+              <w:rPr>
+                <w:sz w:val="20"/>
+                <w:szCs w:val="20"/>
+              </w:rPr>
+              <w:t>preferences,</w:t>
+            </w:r>
+            <w:r>
+              <w:rPr>
+                <w:sz w:val="20"/>
+                <w:szCs w:val="20"/>
+              </w:rPr>
+              <w:t xml:space="preserve"> and feature usefulness.</w:t>
             </w:r>
           </w:p>
         </w:tc>
@@ -5203,6 +5295,7 @@
                 <w:sz w:val="20"/>
                 <w:szCs w:val="20"/>
               </w:rPr>
+              <w:lastRenderedPageBreak/>
               <w:t>Responsible product direction</w:t>
             </w:r>
           </w:p>
@@ -5256,11 +5349,6 @@
       <w:r>
         <w:t>The research and validation phase is planned for 18 May to 31 May 2026. This timeline may be adjusted if participant feedback takes longer to collect.</w:t>
       </w:r>
-    </w:p>
-    <w:p>
-      <w:pPr>
-        <w:spacing w:after="80"/>
-      </w:pPr>
     </w:p>
     <w:tbl>
       <w:tblPr>
@@ -5432,7 +5520,14 @@
                 <w:sz w:val="20"/>
                 <w:szCs w:val="20"/>
               </w:rPr>
-              <w:t>Finalise research plan and prepare interview and survey questions.</w:t>
+              <w:t>Finalise research plan, prepare interview,</w:t>
+            </w:r>
+            <w:r>
+              <w:rPr>
+                <w:sz w:val="20"/>
+                <w:szCs w:val="20"/>
+              </w:rPr>
+              <w:t xml:space="preserve"> and survey questions.</w:t>
             </w:r>
           </w:p>
         </w:tc>
@@ -5866,7 +5961,6 @@
         <w:spacing w:before="40" w:after="40"/>
       </w:pPr>
       <w:r>
-        <w:lastRenderedPageBreak/>
         <w:t>Validated or challenged feedback on each proposed MVP feature.</w:t>
       </w:r>
     </w:p>
@@ -5994,11 +6088,6 @@
       <w:r>
         <w:t>Research findings will directly support the following project documents and development decisions:</w:t>
       </w:r>
-    </w:p>
-    <w:p>
-      <w:pPr>
-        <w:spacing w:after="80"/>
-      </w:pPr>
     </w:p>
     <w:tbl>
       <w:tblPr>
@@ -6048,6 +6137,7 @@
                 <w:sz w:val="20"/>
                 <w:szCs w:val="20"/>
               </w:rPr>
+              <w:lastRenderedPageBreak/>
               <w:t>Document or Output</w:t>
             </w:r>
           </w:p>
@@ -6514,8 +6604,19 @@
               <w:jc w:val="both"/>
             </w:pPr>
             <w:r>
-              <w:lastRenderedPageBreak/>
-              <w:t>The primary goal is to ensure the app is useful, realistic and responsibly designed before committing to build. Findings will feed directly into the MVP scope, feature backlog, competitor analysis, assumptions and risks register, and project roadmap — all of which are cross-referenced in Section 13.</w:t>
+              <w:t xml:space="preserve">The primary goal is to ensure the app is useful, </w:t>
+            </w:r>
+            <w:r>
+              <w:t>realistic,</w:t>
+            </w:r>
+            <w:r>
+              <w:t xml:space="preserve"> and responsibly designed before committing to build. Findings will feed directly into the MVP scope, feature backlog, competitor analysis, </w:t>
+            </w:r>
+            <w:r>
+              <w:t>assumptions,</w:t>
+            </w:r>
+            <w:r>
+              <w:t xml:space="preserve"> and risks register, and project roadmap — all of which are cross-referenced in Section 13.</w:t>
             </w:r>
           </w:p>
         </w:tc>

</xml_diff>